<commit_message>
Another fucking plot line.
</commit_message>
<xml_diff>
--- a/Chapter 16 - Henry.docx
+++ b/Chapter 16 - Henry.docx
@@ -361,13 +361,7 @@
     </w:p>
     <w:p>
       <w:r>
-        <w:t>“Do you have leaves, a pot and China cups?” Henry gestured around at the pews, several of which were filled with China services.</w:t>
-      </w:r>
-      <w:r>
-        <w:t xml:space="preserve"> </w:t>
-      </w:r>
-      <w:r>
-        <w:t xml:space="preserve"> “Ah yes, but about the leaves?”</w:t>
+        <w:t>“Do you have leaves, a pot and China cups?” Henry gestured around at the pews, several of which were filled with China services.  “Ah yes, but about the leaves?”</w:t>
       </w:r>
       <w:r>
         <w:br/>
@@ -572,7 +566,50 @@
     </w:p>
     <w:p>
       <w:r>
-        <w:t>“</w:t>
+        <w:t>“So, why is it of any interest?”</w:t>
+      </w:r>
+      <w:r>
+        <w:br/>
+        <w:t>“Because Harrison Corner wasn’t trustafarian drifter that he appeared to be.”</w:t>
+      </w:r>
+    </w:p>
+    <w:p>
+      <w:r>
+        <w:t>“He wasn’t?”</w:t>
+      </w:r>
+    </w:p>
+    <w:p>
+      <w:r>
+        <w:t>“No, he was a spy.”</w:t>
+      </w:r>
+    </w:p>
+    <w:p>
+      <w:r>
+        <w:t>“And this is important why?”</w:t>
+      </w:r>
+      <w:r>
+        <w:br/>
+        <w:t>“Because everywhere he went, Paris, Berlin, Constantinople, Vienna, he would leave the manuscript of yet another book of his appalling poems. But hidden in them would be his assessment of the current situation.”</w:t>
+      </w:r>
+    </w:p>
+    <w:p>
+      <w:r>
+        <w:t>“So what was Boht’s mistake?”</w:t>
+      </w:r>
+      <w:r>
+        <w:br/>
+        <w:t>“Boht?”</w:t>
+      </w:r>
+      <w:r>
+        <w:br/>
+        <w:t>“That’s whose collection this is. Ulysses T Boht.”</w:t>
+      </w:r>
+      <w:r>
+        <w:br/>
+        <w:t>“His mistake was that this book has skyrocketed in value. Last year, Harrison Corner’s grand grand nephew wrote his biography. And he revealed that his great great uncle had been a spy for the Americans. At a time, when the historical view was that the Americans were doing their level best to not get involved.</w:t>
+      </w:r>
+      <w:r>
+        <w:t xml:space="preserve"> He’s become an kind of American James Bond. But also, an American James Bond who left secret codes in his slim volumes of poetry all over Europe.”</w:t>
       </w:r>
     </w:p>
     <w:p/>

</xml_diff>

<commit_message>
Fix more English issues in Chapter 16 - Henry
</commit_message>
<xml_diff>
--- a/Chapter 16 - Henry.docx
+++ b/Chapter 16 - Henry.docx
@@ -361,7 +361,7 @@
     </w:p>
     <w:p>
       <w:r>
-        <w:t>“Do you have leaves, a pot and China cups?” Henry gestured around at the pews, several of which were filled with China services.  “Ah yes, but about the leaves?”</w:t>
+        <w:t>“Do you have leaves, a pot and china cups?” Henry gestured around at the pews, several of which were filled with china services.  “Ah yes, but about the leaves?”</w:t>
       </w:r>
       <w:r>
         <w:br/>
@@ -370,7 +370,7 @@
     </w:p>
     <w:p>
       <w:r>
-        <w:t>“In that case yes, as paleolithic cow’s milk if you have it.”</w:t>
+        <w:t>“In that case yes, palaeolithic cow’s milk if you have it.”</w:t>
       </w:r>
     </w:p>
     <w:p>
@@ -379,7 +379,7 @@
       </w:r>
       <w:r>
         <w:br/>
-        <w:t>“As you Ernestos” Klee was never quite sure why he added the extra ‘s.’ “As you know, I endeavour be vegan, these days. But the problem with almond milk is that just sits at the bottom of the cup and sulks. And I’ve tried the others.”</w:t>
+        <w:t>“As you Ernestos” Klee was never quite sure why he added the extra ‘s.’ “As you know, I endeavour to be vegan, these days. But the problem with almond milk is that it just sits at the bottom of the cup and sulks. And I’ve tried the others.”</w:t>
       </w:r>
     </w:p>
     <w:p>
@@ -397,7 +397,7 @@
     </w:p>
     <w:p>
       <w:r>
-        <w:t>As always with Henry, he was playing a game. So, he for an hour or so, he’d left Henry to  it, jokingly mentioning that he’d noticed if Henry nicked anything (he so wouldn’t). And he’d slipped out and bought some leaf tea.</w:t>
+        <w:t>As always with Henry, he was playing a game. So, for an hour or so, he’d left Henry to it, jokingly mentioning that he’d noticed if Henry nicked anything (he so wouldn’t). And he’d slipped out and bought some leaf tea.</w:t>
       </w:r>
     </w:p>
     <w:p>
@@ -417,12 +417,12 @@
     </w:p>
     <w:p>
       <w:r>
-        <w:t>“Oh this? This is my labyrinth?”</w:t>
-      </w:r>
-    </w:p>
-    <w:p>
-      <w:r>
-        <w:t>Klee knew that Henry’s love of antiquarian books almost matched his love of porcelain. And he so he’d deliberately not mentioned the library maze, to make sure he had a big reveal.</w:t>
+        <w:t>“Oh this? This is my labyrinth.”</w:t>
+      </w:r>
+    </w:p>
+    <w:p>
+      <w:r>
+        <w:t>Klee knew that Henry’s love of antiquarian books almost matched his love of porcelain. And so he’d deliberately not mentioned the library maze, to make sure he had a big reveal.</w:t>
       </w:r>
     </w:p>
     <w:p>
@@ -432,13 +432,13 @@
     </w:p>
     <w:p>
       <w:r>
-        <w:t xml:space="preserve">When he returned was sitting bolt upright on the chaise longue holding a book in his hand. </w:t>
+        <w:t xml:space="preserve">When he returned he was sitting bolt upright on the chaise longue holding a book in his hand. </w:t>
       </w:r>
     </w:p>
     <w:p>
       <w:r>
         <w:lastRenderedPageBreak/>
-        <w:t>“Did you now about this?”</w:t>
+        <w:t>“Did you know about this?”</w:t>
       </w:r>
     </w:p>
     <w:p>
@@ -461,13 +461,13 @@
       </w:r>
       <w:r>
         <w:br/>
-        <w:t>You see, whoever put this collection together thought they were being cute. Nearly everything is under the radar, most of the books are worth less than a few thousand pounds. Occasionally, there are yards and yards that are</w:t>
+        <w:t>“You see, whoever put this collection together thought they were being cute. Nearly everything is under the radar, most of the books are worth less than a few thousand pounds. Occasionally, there are yards and yards that are</w:t>
       </w:r>
       <w:r>
         <w:t xml:space="preserve"> actually</w:t>
       </w:r>
       <w:r>
-        <w:t xml:space="preserve"> worthless. </w:t>
+        <w:t xml:space="preserve"> worthless.” </w:t>
       </w:r>
     </w:p>
     <w:p>
@@ -476,17 +476,17 @@
       </w:r>
       <w:r>
         <w:br/>
-        <w:t>What is it?</w:t>
-      </w:r>
-    </w:p>
-    <w:p>
-      <w:r>
-        <w:t>“This is a privately printed edition of ‘Pissing blue steam’.”</w:t>
-      </w:r>
-    </w:p>
-    <w:p>
-      <w:r>
-        <w:t>Is it some kind of medical text book?</w:t>
+        <w:t>“What is it?”</w:t>
+      </w:r>
+    </w:p>
+    <w:p>
+      <w:r>
+        <w:t>“This is a privately printed edition of ‘Pissing Blue Steam’.”</w:t>
+      </w:r>
+    </w:p>
+    <w:p>
+      <w:r>
+        <w:t>“Is it some kind of medical textbook?”</w:t>
       </w:r>
     </w:p>
     <w:p>
@@ -496,12 +496,12 @@
     </w:p>
     <w:p>
       <w:r>
-        <w:t>Harrison came from a family of steel barons in Pennsylvania. As part of the rounding of his education, he went on a European tour, at, well, let’s say, quite an interesting point in European history.</w:t>
-      </w:r>
-    </w:p>
-    <w:p>
-      <w:r>
-        <w:t>He in fact left for Europe on the day that Arch Duke Franz Ferdinand was assassinated.</w:t>
+        <w:t>Harrison came from a family of steel barons in Pennsylvania. As part of the rounding off of his education, he went on a European tour, at, well, let’s say, quite an interesting point in European history.</w:t>
+      </w:r>
+    </w:p>
+    <w:p>
+      <w:r>
+        <w:t>He in fact left for Europe on the day that Archduke Franz Ferdinand was assassinated.</w:t>
       </w:r>
     </w:p>
     <w:p>
@@ -509,7 +509,7 @@
         <w:t xml:space="preserve">By the time he got to Paris, the war had already started. And, rather than turn around and go straight back, Mr Corner decided he was going to continue his travels, </w:t>
       </w:r>
       <w:r>
-        <w:t>and the almighty dollar being what it was, that worked out OK, he stayed in Luxury hotels on both sides of the front lines. He travelled to Greece, which most people who were averse to dying of water borne diseases didn’t do in those days. And he generally had a ball. It was only the pesky business of the Americans joining the war in 1917 that put a stop to his peregrinations. He ended up in Switzerland for the rest of the war, and there he fell in with a bad lot?</w:t>
+        <w:t>and the almighty dollar being what it was, that worked out OK, he stayed in luxury hotels on both sides of the front lines. He travelled to Greece, which most people who were averse to dying of water borne diseases didn’t do in those days. And he generally had a ball. It was only the pesky business of the Americans joining the war in 1917 that put a stop to his peregrinations. He ended up in Switzerland for the rest of the war, and there he fell in with a bad lot?</w:t>
       </w:r>
       <w:r>
         <w:br/>
@@ -530,7 +530,7 @@
     </w:p>
     <w:p>
       <w:r>
-        <w:t>“Definitely not. The clue is in the title ‘To Piss Blue steam.’”</w:t>
+        <w:t>“Definitely not. The clue is in the title ‘Pissing Blue Steam.’”</w:t>
       </w:r>
     </w:p>
     <w:p>
@@ -570,7 +570,7 @@
       </w:r>
       <w:r>
         <w:br/>
-        <w:t>“Because Harrison Corner wasn’t trustafarian drifter that he appeared to be.”</w:t>
+        <w:t>“Because Harrison Corner wasn’t the trustafarian drifter that he appeared to be.”</w:t>
       </w:r>
     </w:p>
     <w:p>
@@ -606,24 +606,13 @@
       </w:r>
       <w:r>
         <w:br/>
-        <w:t>“His mistake was that this book has skyrocketed in value. Last year, Harrison Corner’s grand grand nephew wrote his biography. And he revealed that his great great uncle had been a spy for the Americans. At a time, when the historical view was that the Americans were doing their level best to not get involved.</w:t>
-      </w:r>
-      <w:r>
-        <w:t xml:space="preserve"> He’s become an kind of American James Bond. But also, an American James Bond who left secret codes in his slim volumes of poetry all over Europe.”</w:t>
+        <w:t>“His mistake was that this book has skyrocketed in value. Last year, Harrison Corner’s great-grand-nephew wrote his biography. And he revealed that his great-great-uncle had been a spy for the Americans. At a time, when the historical view was that the Americans were doing their level best to not get involved.</w:t>
+      </w:r>
+      <w:r>
+        <w:t xml:space="preserve"> He’s become a kind of American James Bond. But also, an American James Bond who left secret codes in his slim volumes of poetry all over Europe.”</w:t>
       </w:r>
     </w:p>
     <w:p/>
-    <w:p>
-      <w:r>
-        <w:rPr>
-          <w:vanish/>
-        </w:rPr>
-        <w:t>eHihhhhh</w:t>
-      </w:r>
-      <w:r>
-        <w:br/>
-      </w:r>
-    </w:p>
     <w:sectPr>
       <w:pgSz w:w="11906" w:h="16838"/>
       <w:pgMar w:top="1440" w:right="1440" w:bottom="1440" w:left="1440" w:header="0" w:footer="0" w:gutter="0"/>

</xml_diff>